<commit_message>
docs(siblings): README.{html,pdf,docx} catch-up regen for blockers section
Mirrors the README.md edit in f089dd6 that added the "Active blockers —
operator action required" section linking the MTProto credential setup
guide + §11.4.98 audit doc.

Co-Authored-By: Claude Opus 4.7 <noreply@anthropic.com>
</commit_message>
<xml_diff>
--- a/README.docx
+++ b/README.docx
@@ -10,7 +10,7 @@
         <w:t xml:space="preserve">Herald</w:t>
       </w:r>
     </w:p>
-    <w:bookmarkStart w:id="54" w:name="herald"/>
+    <w:bookmarkStart w:id="57" w:name="herald"/>
     <w:p>
       <w:pPr>
         <w:pStyle w:val="Heading1"/>
@@ -2147,7 +2147,7 @@
     </w:p>
     <w:bookmarkEnd w:id="28"/>
     <w:bookmarkEnd w:id="29"/>
-    <w:bookmarkStart w:id="49" w:name="operator-setup-guides"/>
+    <w:bookmarkStart w:id="52" w:name="operator-setup-guides"/>
     <w:p>
       <w:pPr>
         <w:pStyle w:val="Heading2"/>
@@ -3219,8 +3219,90 @@
       </w:r>
     </w:p>
     <w:bookmarkEnd w:id="48"/>
-    <w:bookmarkEnd w:id="49"/>
-    <w:bookmarkStart w:id="50" w:name="mirror--push-convention"/>
+    <w:bookmarkStart w:id="51" w:name="X2d57ec4c52902418777a57d1b6587fe0de5df6e"/>
+    <w:p>
+      <w:pPr>
+        <w:pStyle w:val="Heading3"/>
+      </w:pPr>
+      <w:r>
+        <w:t xml:space="preserve">Active blockers — operator action required</w:t>
+      </w:r>
+    </w:p>
+    <w:p>
+      <w:pPr>
+        <w:pStyle w:val="FirstParagraph"/>
+      </w:pPr>
+      <w:hyperlink r:id="rId49">
+        <w:r>
+          <w:rPr>
+            <w:rStyle w:val="VerbatimChar"/>
+          </w:rPr>
+          <w:t xml:space="preserve">docs/requirements/blockers/missing_env_variables.md</w:t>
+        </w:r>
+      </w:hyperlink>
+      <w:r>
+        <w:t xml:space="preserve"> </w:t>
+      </w:r>
+      <w:r>
+        <w:t xml:space="preserve">— the step-by-step MTProto credential setup the operator must complete to unblock Wave 8 Track B (the full-automation rewrite of</w:t>
+      </w:r>
+      <w:r>
+        <w:t xml:space="preserve"> </w:t>
+      </w:r>
+      <w:r>
+        <w:rPr>
+          <w:rStyle w:val="VerbatimChar"/>
+        </w:rPr>
+        <w:t xml:space="preserve">TestSubscribe_LiveBotAPI</w:t>
+      </w:r>
+      <w:r>
+        <w:t xml:space="preserve">,</w:t>
+      </w:r>
+      <w:r>
+        <w:t xml:space="preserve"> </w:t>
+      </w:r>
+      <w:r>
+        <w:rPr>
+          <w:rStyle w:val="VerbatimChar"/>
+        </w:rPr>
+        <w:t xml:space="preserve">tests/test_wave6_live_loop.sh</w:t>
+      </w:r>
+      <w:r>
+        <w:t xml:space="preserve">, and Wave 6.5 lifecycle scenarios per HelixConstitution §11.4.98 + Herald §108.m). Available in Markdown / HTML / PDF / DOCX.</w:t>
+      </w:r>
+      <w:r>
+        <w:t xml:space="preserve"> </w:t>
+      </w:r>
+      <w:r>
+        <w:rPr>
+          <w:b/>
+          <w:bCs/>
+        </w:rPr>
+        <w:t xml:space="preserve">Required for §11.4.98 compliance — release-gate item.</w:t>
+      </w:r>
+    </w:p>
+    <w:p>
+      <w:pPr>
+        <w:pStyle w:val="BodyText"/>
+      </w:pPr>
+      <w:hyperlink r:id="rId50">
+        <w:r>
+          <w:rPr>
+            <w:rStyle w:val="VerbatimChar"/>
+          </w:rPr>
+          <w:t xml:space="preserve">docs/audits/full-automation-114-98-audit-2026-05-28.md</w:t>
+        </w:r>
+      </w:hyperlink>
+      <w:r>
+        <w:t xml:space="preserve"> </w:t>
+      </w:r>
+      <w:r>
+        <w:t xml:space="preserve">— the canonical classification of every Herald test against §11.4.98 (794 tests audited: 758 COMPLIANT-hermetic, 32 COMPLIANT-with-creds-bootstrap, 4 NON-COMPLIANT-manual-dep, 1 STRUCTURALLY-BROKEN). NON-COMPLIANT items have until 2026-06-27 (T+30 days) to be rewritten before graduating to §11.4.90 Obsolete.</w:t>
+      </w:r>
+    </w:p>
+    <w:bookmarkEnd w:id="51"/>
+    <w:bookmarkEnd w:id="52"/>
+    <w:bookmarkStart w:id="53" w:name="mirror--push-convention"/>
     <w:p>
       <w:pPr>
         <w:pStyle w:val="Heading2"/>
@@ -3566,8 +3648,8 @@
         <w:t xml:space="preserve">declarations and configures git remotes accordingly; the same pattern can be adapted for Herald.</w:t>
       </w:r>
     </w:p>
-    <w:bookmarkEnd w:id="50"/>
-    <w:bookmarkStart w:id="52" w:name="license"/>
+    <w:bookmarkEnd w:id="53"/>
+    <w:bookmarkStart w:id="55" w:name="license"/>
     <w:p>
       <w:pPr>
         <w:pStyle w:val="Heading2"/>
@@ -3580,7 +3662,7 @@
       <w:pPr>
         <w:pStyle w:val="FirstParagraph"/>
       </w:pPr>
-      <w:hyperlink r:id="rId51">
+      <w:hyperlink r:id="rId54">
         <w:r>
           <w:rPr>
             <w:rStyle w:val="VerbatimChar"/>
@@ -3595,8 +3677,8 @@
         <w:t xml:space="preserve">— see file for terms.</w:t>
       </w:r>
     </w:p>
-    <w:bookmarkEnd w:id="52"/>
-    <w:bookmarkStart w:id="53" w:name="contact--contribution"/>
+    <w:bookmarkEnd w:id="55"/>
+    <w:bookmarkStart w:id="56" w:name="contact--contribution"/>
     <w:p>
       <w:pPr>
         <w:pStyle w:val="Heading2"/>
@@ -3613,8 +3695,8 @@
         <w:t xml:space="preserve">Substantive contributions land via PRs on GitHub; mirrors are read-only for external consumers. Inheritance rules and the gate apply to every PR.</w:t>
       </w:r>
     </w:p>
-    <w:bookmarkEnd w:id="53"/>
-    <w:bookmarkEnd w:id="54"/>
+    <w:bookmarkEnd w:id="56"/>
+    <w:bookmarkEnd w:id="57"/>
     <w:sectPr>
       <w:footnotePr>
         <w:numRestart w:val="eachSect"/>

</xml_diff>

<commit_message>
docs: cross-link the 8 per-flavor operator guides from README + INTEGRATION.md §10/§14
Closes the discoverability follow-up: adds a 'Per-flavor operator guides' table to README (+ToC) and an 'Operator guide' column to the INTEGRATION.md §10 flavor table (incl. the qaherald row) + a §14 help bullet. Every row is a §11.4.91 self-contained clause derived from each guide's own summary (anti-bluff). Reconciled with the §1 qaherald row from 338a896 (different table — no dup). From a worktree stream.

Co-Authored-By: Claude Opus 4.8 <noreply@anthropic.com>
</commit_message>
<xml_diff>
--- a/README.docx
+++ b/README.docx
@@ -10,7 +10,7 @@
         <w:t xml:space="preserve">Herald</w:t>
       </w:r>
     </w:p>
-    <w:bookmarkStart w:id="61" w:name="herald"/>
+    <w:bookmarkStart w:id="70" w:name="herald"/>
     <w:p>
       <w:pPr>
         <w:pStyle w:val="Heading1"/>
@@ -518,6 +518,23 @@
           <w:numId w:val="1003"/>
         </w:numPr>
       </w:pPr>
+      <w:hyperlink w:anchor="per-flavor-operator-guides">
+        <w:r>
+          <w:rPr>
+            <w:rStyle w:val="Hyperlink"/>
+          </w:rPr>
+          <w:t xml:space="preserve">Per-flavor operator guides</w:t>
+        </w:r>
+      </w:hyperlink>
+    </w:p>
+    <w:p>
+      <w:pPr>
+        <w:pStyle w:val="Compact"/>
+        <w:numPr>
+          <w:ilvl w:val="1"/>
+          <w:numId w:val="1003"/>
+        </w:numPr>
+      </w:pPr>
       <w:hyperlink w:anchor="credentials-master-guide">
         <w:r>
           <w:rPr>
@@ -2147,7 +2164,7 @@
     </w:p>
     <w:bookmarkEnd w:id="28"/>
     <w:bookmarkEnd w:id="29"/>
-    <w:bookmarkStart w:id="52" w:name="operator-setup-guides"/>
+    <w:bookmarkStart w:id="61" w:name="operator-setup-guides"/>
     <w:p>
       <w:pPr>
         <w:pStyle w:val="Heading2"/>
@@ -2965,792 +2982,44 @@
       </w:tr>
     </w:tbl>
     <w:bookmarkEnd w:id="46"/>
-    <w:bookmarkStart w:id="48" w:name="credentials-master-guide"/>
+    <w:bookmarkStart w:id="55" w:name="per-flavor-operator-guides"/>
     <w:p>
       <w:pPr>
         <w:pStyle w:val="Heading3"/>
       </w:pPr>
       <w:r>
-        <w:t xml:space="preserve">Credentials master guide</w:t>
+        <w:t xml:space="preserve">Per-flavor operator guides</w:t>
       </w:r>
     </w:p>
     <w:p>
       <w:pPr>
         <w:pStyle w:val="FirstParagraph"/>
       </w:pPr>
-      <w:hyperlink r:id="rId47">
+      <w:r>
+        <w:t xml:space="preserve">Each Herald flavor binary ships with a nano-detail operator reference under</w:t>
+      </w:r>
+      <w:r>
+        <w:t xml:space="preserve"> </w:t>
+      </w:r>
+      <w:hyperlink r:id="rId12">
         <w:r>
           <w:rPr>
             <w:rStyle w:val="VerbatimChar"/>
           </w:rPr>
-          <w:t xml:space="preserve">docs/guides/OPERATOR_CREDENTIALS.md</w:t>
+          <w:t xml:space="preserve">docs/guides/</w:t>
         </w:r>
       </w:hyperlink>
       <w:r>
-        <w:t xml:space="preserve"> </w:t>
-      </w:r>
-      <w:r>
-        <w:t xml:space="preserve">is the umbrella reference covering:</w:t>
-      </w:r>
-    </w:p>
-    <w:p>
-      <w:pPr>
-        <w:pStyle w:val="Compact"/>
-        <w:numPr>
-          <w:ilvl w:val="0"/>
-          <w:numId w:val="1009"/>
-        </w:numPr>
-      </w:pPr>
-      <w:r>
-        <w:t xml:space="preserve">The 12-factor resolution order (CLI flag &gt; shell exports &gt;</w:t>
-      </w:r>
-      <w:r>
-        <w:t xml:space="preserve"> </w:t>
-      </w:r>
-      <w:r>
-        <w:rPr>
-          <w:rStyle w:val="VerbatimChar"/>
-        </w:rPr>
-        <w:t xml:space="preserve">.env</w:t>
-      </w:r>
-      <w:r>
-        <w:t xml:space="preserve"> </w:t>
-      </w:r>
-      <w:r>
-        <w:t xml:space="preserve">&gt; defaults)</w:t>
-      </w:r>
-    </w:p>
-    <w:p>
-      <w:pPr>
-        <w:pStyle w:val="Compact"/>
-        <w:numPr>
-          <w:ilvl w:val="0"/>
-          <w:numId w:val="1009"/>
-        </w:numPr>
-      </w:pPr>
-      <w:r>
-        <w:t xml:space="preserve">How to set credentials via</w:t>
-      </w:r>
-      <w:r>
-        <w:t xml:space="preserve"> </w:t>
-      </w:r>
-      <w:r>
-        <w:rPr>
-          <w:rStyle w:val="VerbatimChar"/>
-        </w:rPr>
-        <w:t xml:space="preserve">~/.bashrc</w:t>
-      </w:r>
-      <w:r>
-        <w:t xml:space="preserve"> </w:t>
-      </w:r>
-      <w:r>
-        <w:t xml:space="preserve">/</w:t>
-      </w:r>
-      <w:r>
-        <w:t xml:space="preserve"> </w:t>
-      </w:r>
-      <w:r>
-        <w:rPr>
-          <w:rStyle w:val="VerbatimChar"/>
-        </w:rPr>
-        <w:t xml:space="preserve">~/.zshrc</w:t>
-      </w:r>
-      <w:r>
-        <w:t xml:space="preserve"> </w:t>
-      </w:r>
-      <w:r>
-        <w:t xml:space="preserve">(shell-export path) AND</w:t>
-      </w:r>
-      <w:r>
-        <w:t xml:space="preserve"> </w:t>
-      </w:r>
-      <w:r>
-        <w:rPr>
-          <w:rStyle w:val="VerbatimChar"/>
-        </w:rPr>
-        <w:t xml:space="preserve">.env</w:t>
-      </w:r>
-      <w:r>
-        <w:t xml:space="preserve"> </w:t>
-      </w:r>
-      <w:r>
-        <w:t xml:space="preserve">(project-local path) — both supported per spec V3 §3.3</w:t>
-      </w:r>
-    </w:p>
-    <w:p>
-      <w:pPr>
-        <w:pStyle w:val="Compact"/>
-        <w:numPr>
-          <w:ilvl w:val="0"/>
-          <w:numId w:val="1009"/>
-        </w:numPr>
-      </w:pPr>
-      <w:r>
-        <w:t xml:space="preserve">Pre-commit secrets audit checklist (</w:t>
-      </w:r>
-      <w:r>
-        <w:rPr>
-          <w:rStyle w:val="VerbatimChar"/>
-        </w:rPr>
-        <w:t xml:space="preserve">.env</w:t>
-      </w:r>
-      <w:r>
-        <w:t xml:space="preserve"> </w:t>
-      </w:r>
-      <w:r>
-        <w:t xml:space="preserve">not tracked; no obvious-format secrets;</w:t>
-      </w:r>
-      <w:r>
-        <w:t xml:space="preserve"> </w:t>
-      </w:r>
-      <w:r>
-        <w:rPr>
-          <w:rStyle w:val="VerbatimChar"/>
-        </w:rPr>
-        <w:t xml:space="preserve">.env.example</w:t>
-      </w:r>
-      <w:r>
-        <w:t xml:space="preserve"> </w:t>
-      </w:r>
-      <w:r>
-        <w:t xml:space="preserve">only has placeholders)</w:t>
-      </w:r>
-    </w:p>
-    <w:p>
-      <w:pPr>
-        <w:pStyle w:val="Compact"/>
-        <w:numPr>
-          <w:ilvl w:val="0"/>
-          <w:numId w:val="1009"/>
-        </w:numPr>
-      </w:pPr>
-      <w:r>
-        <w:t xml:space="preserve">Quickstart-compose vs native pherald operating modes</w:t>
-      </w:r>
-    </w:p>
-    <w:p>
-      <w:pPr>
-        <w:pStyle w:val="Compact"/>
-        <w:numPr>
-          <w:ilvl w:val="0"/>
-          <w:numId w:val="1009"/>
-        </w:numPr>
-      </w:pPr>
-      <w:r>
-        <w:t xml:space="preserve">Troubleshooting (SQLSTATE 28P01, "DSN not set", SKIP-with-reason logic per §11.4.3, …)</w:t>
-      </w:r>
-    </w:p>
-    <w:p>
-      <w:pPr>
-        <w:pStyle w:val="FirstParagraph"/>
-      </w:pPr>
-      <w:r>
-        <w:t xml:space="preserve">Per Universal Constitution §11.4.10:</w:t>
-      </w:r>
-      <w:r>
-        <w:t xml:space="preserve"> </w:t>
-      </w:r>
-      <w:r>
-        <w:rPr>
-          <w:rStyle w:val="VerbatimChar"/>
-          <w:b/>
-          <w:bCs/>
-        </w:rPr>
-        <w:t xml:space="preserve">.env</w:t>
-      </w:r>
-      <w:r>
-        <w:rPr>
-          <w:b/>
-          <w:bCs/>
-        </w:rPr>
-        <w:t xml:space="preserve"> </w:t>
-      </w:r>
-      <w:r>
-        <w:rPr>
-          <w:b/>
-          <w:bCs/>
-        </w:rPr>
-        <w:t xml:space="preserve">files MUST NEVER be committed</w:t>
-      </w:r>
-      <w:r>
-        <w:t xml:space="preserve">. The repo's</w:t>
-      </w:r>
-      <w:r>
-        <w:t xml:space="preserve"> </w:t>
-      </w:r>
-      <w:r>
-        <w:rPr>
-          <w:rStyle w:val="VerbatimChar"/>
-        </w:rPr>
-        <w:t xml:space="preserve">.gitignore</w:t>
-      </w:r>
-      <w:r>
-        <w:t xml:space="preserve"> </w:t>
-      </w:r>
-      <w:r>
-        <w:t xml:space="preserve">already covers</w:t>
-      </w:r>
-      <w:r>
-        <w:t xml:space="preserve"> </w:t>
-      </w:r>
-      <w:r>
-        <w:rPr>
-          <w:rStyle w:val="VerbatimChar"/>
-        </w:rPr>
-        <w:t xml:space="preserve">.env</w:t>
-      </w:r>
-      <w:r>
-        <w:t xml:space="preserve">. The committed</w:t>
-      </w:r>
-      <w:r>
-        <w:t xml:space="preserve"> </w:t>
-      </w:r>
-      <w:r>
-        <w:rPr>
-          <w:rStyle w:val="VerbatimChar"/>
-        </w:rPr>
-        <w:t xml:space="preserve">quickstart/.env.example</w:t>
-      </w:r>
-      <w:r>
-        <w:t xml:space="preserve"> </w:t>
-      </w:r>
-      <w:r>
-        <w:t xml:space="preserve">is the only credentials-file that lives in git, and it contains only placeholder values.</w:t>
-      </w:r>
-    </w:p>
-    <w:bookmarkEnd w:id="48"/>
-    <w:bookmarkStart w:id="51" w:name="X2d57ec4c52902418777a57d1b6587fe0de5df6e"/>
-    <w:p>
-      <w:pPr>
-        <w:pStyle w:val="Heading3"/>
-      </w:pPr>
-      <w:r>
-        <w:t xml:space="preserve">Active blockers — operator action required</w:t>
-      </w:r>
-    </w:p>
-    <w:p>
-      <w:pPr>
-        <w:pStyle w:val="FirstParagraph"/>
-      </w:pPr>
-      <w:hyperlink r:id="rId49">
-        <w:r>
-          <w:rPr>
-            <w:rStyle w:val="VerbatimChar"/>
-          </w:rPr>
-          <w:t xml:space="preserve">docs/requirements/blockers/missing_env_variables.md</w:t>
-        </w:r>
-      </w:hyperlink>
-      <w:r>
-        <w:t xml:space="preserve"> </w:t>
-      </w:r>
-      <w:r>
-        <w:t xml:space="preserve">— the step-by-step MTProto credential setup the operator must complete to unblock Wave 8 Track B (the full-automation rewrite of</w:t>
-      </w:r>
-      <w:r>
-        <w:t xml:space="preserve"> </w:t>
-      </w:r>
-      <w:r>
-        <w:rPr>
-          <w:rStyle w:val="VerbatimChar"/>
-        </w:rPr>
-        <w:t xml:space="preserve">TestSubscribe_LiveBotAPI</w:t>
-      </w:r>
-      <w:r>
-        <w:t xml:space="preserve">,</w:t>
-      </w:r>
-      <w:r>
-        <w:t xml:space="preserve"> </w:t>
-      </w:r>
-      <w:r>
-        <w:rPr>
-          <w:rStyle w:val="VerbatimChar"/>
-        </w:rPr>
-        <w:t xml:space="preserve">tests/test_wave6_live_loop.sh</w:t>
-      </w:r>
-      <w:r>
-        <w:t xml:space="preserve">, and Wave 6.5 lifecycle scenarios per HelixConstitution §11.4.98 + Herald §108.m). Available in Markdown / HTML / PDF / DOCX.</w:t>
-      </w:r>
-      <w:r>
-        <w:t xml:space="preserve"> </w:t>
-      </w:r>
-      <w:r>
-        <w:rPr>
-          <w:b/>
-          <w:bCs/>
-        </w:rPr>
-        <w:t xml:space="preserve">Required for §11.4.98 compliance — release-gate item.</w:t>
-      </w:r>
-    </w:p>
-    <w:p>
-      <w:pPr>
-        <w:pStyle w:val="BodyText"/>
-      </w:pPr>
-      <w:hyperlink r:id="rId50">
-        <w:r>
-          <w:rPr>
-            <w:rStyle w:val="VerbatimChar"/>
-          </w:rPr>
-          <w:t xml:space="preserve">docs/audits/full-automation-114-98-audit-2026-05-28.md</w:t>
-        </w:r>
-      </w:hyperlink>
-      <w:r>
-        <w:t xml:space="preserve"> </w:t>
-      </w:r>
-      <w:r>
-        <w:t xml:space="preserve">— the canonical classification of every Herald test against §11.4.98 (794 tests audited: 758 COMPLIANT-hermetic, 32 COMPLIANT-with-creds-bootstrap, 4 NON-COMPLIANT-manual-dep, 1 STRUCTURALLY-BROKEN). NON-COMPLIANT items have until 2026-06-27 (T+30 days) to be rewritten before graduating to §11.4.90 Obsolete.</w:t>
-      </w:r>
-    </w:p>
-    <w:bookmarkEnd w:id="51"/>
-    <w:bookmarkEnd w:id="52"/>
-    <w:bookmarkStart w:id="53" w:name="mirror--push-convention"/>
-    <w:p>
-      <w:pPr>
-        <w:pStyle w:val="Heading2"/>
-      </w:pPr>
-      <w:r>
-        <w:t xml:space="preserve">Mirror &amp; push convention</w:t>
-      </w:r>
-    </w:p>
-    <w:p>
-      <w:pPr>
-        <w:pStyle w:val="FirstParagraph"/>
-      </w:pPr>
-      <w:r>
-        <w:t xml:space="preserve">Herald is mirrored to four hosts. The</w:t>
-      </w:r>
-      <w:r>
-        <w:t xml:space="preserve"> </w:t>
-      </w:r>
-      <w:r>
-        <w:rPr>
-          <w:rStyle w:val="VerbatimChar"/>
-        </w:rPr>
-        <w:t xml:space="preserve">origin</w:t>
-      </w:r>
-      <w:r>
-        <w:t xml:space="preserve"> </w:t>
-      </w:r>
-      <w:r>
-        <w:t xml:space="preserve">remote is</w:t>
-      </w:r>
-      <w:r>
-        <w:t xml:space="preserve"> </w:t>
-      </w:r>
-      <w:r>
-        <w:rPr>
-          <w:b/>
-          <w:bCs/>
-        </w:rPr>
-        <w:t xml:space="preserve">fan-out</w:t>
-      </w:r>
-      <w:r>
-        <w:t xml:space="preserve">: one fetch URL + four push URLs. A single</w:t>
-      </w:r>
-      <w:r>
-        <w:t xml:space="preserve"> </w:t>
-      </w:r>
-      <w:r>
-        <w:rPr>
-          <w:rStyle w:val="VerbatimChar"/>
-        </w:rPr>
-        <w:t xml:space="preserve">git push origin main</w:t>
-      </w:r>
-      <w:r>
-        <w:t xml:space="preserve"> </w:t>
-      </w:r>
-      <w:r>
-        <w:t xml:space="preserve">propagates to every mirror in one operation.</w:t>
-      </w:r>
-    </w:p>
-    <w:tbl>
-      <w:tblPr>
-        <w:tblStyle w:val="Table"/>
-        <w:tblW w:type="auto" w:w="0"/>
-        <w:tblLook w:firstRow="1" w:lastRow="0" w:firstColumn="0" w:lastColumn="0" w:noHBand="0" w:noVBand="0" w:val="0020"/>
-      </w:tblPr>
-      <w:tblGrid>
-        <w:gridCol w:w="3960"/>
-        <w:gridCol w:w="3960"/>
-      </w:tblGrid>
-      <w:tr>
-        <w:trPr>
-          <w:tblHeader w:val="on"/>
-        </w:trPr>
-        <w:tc>
-          <w:tcPr/>
-          <w:p>
-            <w:pPr>
-              <w:pStyle w:val="Compact"/>
-            </w:pPr>
-            <w:r>
-              <w:t xml:space="preserve">Remote name</w:t>
-            </w:r>
-          </w:p>
-        </w:tc>
-        <w:tc>
-          <w:tcPr/>
-          <w:p>
-            <w:pPr>
-              <w:pStyle w:val="Compact"/>
-            </w:pPr>
-            <w:r>
-              <w:t xml:space="preserve">URL</w:t>
-            </w:r>
-          </w:p>
-        </w:tc>
-      </w:tr>
-      <w:tr>
-        <w:tc>
-          <w:tcPr/>
-          <w:p>
-            <w:pPr>
-              <w:pStyle w:val="Compact"/>
-            </w:pPr>
-            <w:r>
-              <w:rPr>
-                <w:rStyle w:val="VerbatimChar"/>
-              </w:rPr>
-              <w:t xml:space="preserve">github</w:t>
-            </w:r>
-          </w:p>
-        </w:tc>
-        <w:tc>
-          <w:tcPr/>
-          <w:p>
-            <w:pPr>
-              <w:pStyle w:val="Compact"/>
-            </w:pPr>
-            <w:r>
-              <w:rPr>
-                <w:rStyle w:val="VerbatimChar"/>
-              </w:rPr>
-              <w:t xml:space="preserve">git@github.com:vasic-digital/Herald.git</w:t>
-            </w:r>
-          </w:p>
-        </w:tc>
-      </w:tr>
-      <w:tr>
-        <w:tc>
-          <w:tcPr/>
-          <w:p>
-            <w:pPr>
-              <w:pStyle w:val="Compact"/>
-            </w:pPr>
-            <w:r>
-              <w:rPr>
-                <w:rStyle w:val="VerbatimChar"/>
-              </w:rPr>
-              <w:t xml:space="preserve">gitlab</w:t>
-            </w:r>
-          </w:p>
-        </w:tc>
-        <w:tc>
-          <w:tcPr/>
-          <w:p>
-            <w:pPr>
-              <w:pStyle w:val="Compact"/>
-            </w:pPr>
-            <w:r>
-              <w:rPr>
-                <w:rStyle w:val="VerbatimChar"/>
-              </w:rPr>
-              <w:t xml:space="preserve">git@gitlab.com:vasic-digital/herald.git</w:t>
-            </w:r>
-          </w:p>
-        </w:tc>
-      </w:tr>
-      <w:tr>
-        <w:tc>
-          <w:tcPr/>
-          <w:p>
-            <w:pPr>
-              <w:pStyle w:val="Compact"/>
-            </w:pPr>
-            <w:r>
-              <w:rPr>
-                <w:rStyle w:val="VerbatimChar"/>
-              </w:rPr>
-              <w:t xml:space="preserve">gitflic</w:t>
-            </w:r>
-          </w:p>
-        </w:tc>
-        <w:tc>
-          <w:tcPr/>
-          <w:p>
-            <w:pPr>
-              <w:pStyle w:val="Compact"/>
-            </w:pPr>
-            <w:r>
-              <w:rPr>
-                <w:rStyle w:val="VerbatimChar"/>
-              </w:rPr>
-              <w:t xml:space="preserve">git@gitflic.ru:vasic-digital/herald.git</w:t>
-            </w:r>
-          </w:p>
-        </w:tc>
-      </w:tr>
-      <w:tr>
-        <w:tc>
-          <w:tcPr/>
-          <w:p>
-            <w:pPr>
-              <w:pStyle w:val="Compact"/>
-            </w:pPr>
-            <w:r>
-              <w:rPr>
-                <w:rStyle w:val="VerbatimChar"/>
-              </w:rPr>
-              <w:t xml:space="preserve">gitverse</w:t>
-            </w:r>
-          </w:p>
-        </w:tc>
-        <w:tc>
-          <w:tcPr/>
-          <w:p>
-            <w:pPr>
-              <w:pStyle w:val="Compact"/>
-            </w:pPr>
-            <w:r>
-              <w:rPr>
-                <w:rStyle w:val="VerbatimChar"/>
-              </w:rPr>
-              <w:t xml:space="preserve">git@gitverse.ru:vasic-digital/Herald.git</w:t>
-            </w:r>
-          </w:p>
-        </w:tc>
-      </w:tr>
-      <w:tr>
-        <w:tc>
-          <w:tcPr/>
-          <w:p>
-            <w:pPr>
-              <w:pStyle w:val="Compact"/>
-            </w:pPr>
-            <w:r>
-              <w:rPr>
-                <w:rStyle w:val="VerbatimChar"/>
-              </w:rPr>
-              <w:t xml:space="preserve">origin</w:t>
-            </w:r>
-          </w:p>
-        </w:tc>
-        <w:tc>
-          <w:tcPr/>
-          <w:p>
-            <w:pPr>
-              <w:pStyle w:val="Compact"/>
-            </w:pPr>
-            <w:r>
-              <w:t xml:space="preserve">(fetch from</w:t>
-            </w:r>
-            <w:r>
-              <w:t xml:space="preserve"> </w:t>
-            </w:r>
-            <w:r>
-              <w:rPr>
-                <w:rStyle w:val="VerbatimChar"/>
-              </w:rPr>
-              <w:t xml:space="preserve">github</w:t>
-            </w:r>
-            <w:r>
-              <w:t xml:space="preserve">; push fans out to all four)</w:t>
-            </w:r>
-          </w:p>
-        </w:tc>
-      </w:tr>
-    </w:tbl>
-    <w:p>
-      <w:pPr>
-        <w:pStyle w:val="BodyText"/>
-      </w:pPr>
-      <w:r>
-        <w:t xml:space="preserve">Each entry under</w:t>
-      </w:r>
-      <w:r>
-        <w:t xml:space="preserve"> </w:t>
-      </w:r>
-      <w:r>
-        <w:rPr>
-          <w:rStyle w:val="VerbatimChar"/>
-        </w:rPr>
-        <w:t xml:space="preserve">upstreams/</w:t>
-      </w:r>
-      <w:r>
-        <w:t xml:space="preserve"> </w:t>
-      </w:r>
-      <w:r>
-        <w:t xml:space="preserve">is a shell script that exports a single</w:t>
-      </w:r>
-      <w:r>
-        <w:t xml:space="preserve"> </w:t>
-      </w:r>
-      <w:r>
-        <w:rPr>
-          <w:rStyle w:val="VerbatimChar"/>
-        </w:rPr>
-        <w:t xml:space="preserve">UPSTREAMABLE_REPOSITORY=…</w:t>
-      </w:r>
-      <w:r>
-        <w:t xml:space="preserve"> </w:t>
-      </w:r>
-      <w:r>
-        <w:t xml:space="preserve">URL and is meant to be</w:t>
-      </w:r>
-      <w:r>
-        <w:t xml:space="preserve"> </w:t>
-      </w:r>
-      <w:r>
-        <w:rPr>
-          <w:b/>
-          <w:bCs/>
-        </w:rPr>
-        <w:t xml:space="preserve">sourced</w:t>
-      </w:r>
-      <w:r>
-        <w:t xml:space="preserve">, not executed for its output. Capitalization matches each host's brand (GitFlic, GitVerse); do not normalize to lowercase or collapse into one file — external mirror-push tooling keys on the per-file split.</w:t>
-      </w:r>
-    </w:p>
-    <w:p>
-      <w:pPr>
-        <w:pStyle w:val="BodyText"/>
-      </w:pPr>
-      <w:r>
-        <w:t xml:space="preserve">If you ever need to rebuild the fan-out configuration, the constitution submodule ships</w:t>
-      </w:r>
-      <w:r>
-        <w:t xml:space="preserve"> </w:t>
-      </w:r>
-      <w:r>
-        <w:rPr>
-          <w:rStyle w:val="VerbatimChar"/>
-        </w:rPr>
-        <w:t xml:space="preserve">install_upstreams.sh</w:t>
-      </w:r>
-      <w:r>
-        <w:t xml:space="preserve"> </w:t>
-      </w:r>
-      <w:r>
-        <w:t xml:space="preserve">that consumes</w:t>
-      </w:r>
-      <w:r>
-        <w:t xml:space="preserve"> </w:t>
-      </w:r>
-      <w:r>
-        <w:rPr>
-          <w:rStyle w:val="VerbatimChar"/>
-        </w:rPr>
-        <w:t xml:space="preserve">Upstreams/*.sh</w:t>
-      </w:r>
-      <w:r>
-        <w:t xml:space="preserve"> </w:t>
-      </w:r>
-      <w:r>
-        <w:t xml:space="preserve">declarations and configures git remotes accordingly; the same pattern can be adapted for Herald.</w:t>
-      </w:r>
-    </w:p>
-    <w:bookmarkEnd w:id="53"/>
-    <w:bookmarkStart w:id="55" w:name="license"/>
-    <w:p>
-      <w:pPr>
-        <w:pStyle w:val="Heading2"/>
-      </w:pPr>
-      <w:r>
-        <w:t xml:space="preserve">License</w:t>
-      </w:r>
-    </w:p>
-    <w:p>
-      <w:pPr>
-        <w:pStyle w:val="FirstParagraph"/>
-      </w:pPr>
-      <w:hyperlink r:id="rId54">
-        <w:r>
-          <w:rPr>
-            <w:rStyle w:val="VerbatimChar"/>
-          </w:rPr>
-          <w:t xml:space="preserve">LICENSE</w:t>
-        </w:r>
-      </w:hyperlink>
-      <w:r>
-        <w:t xml:space="preserve"> </w:t>
-      </w:r>
-      <w:r>
-        <w:t xml:space="preserve">— see file for terms.</w:t>
-      </w:r>
-    </w:p>
-    <w:bookmarkEnd w:id="55"/>
-    <w:bookmarkStart w:id="56" w:name="contact--contribution"/>
-    <w:p>
-      <w:pPr>
-        <w:pStyle w:val="Heading2"/>
-      </w:pPr>
-      <w:r>
-        <w:t xml:space="preserve">Contact / contribution</w:t>
-      </w:r>
-    </w:p>
-    <w:p>
-      <w:pPr>
-        <w:pStyle w:val="FirstParagraph"/>
-      </w:pPr>
-      <w:r>
-        <w:t xml:space="preserve">Substantive contributions land via PRs on GitHub; mirrors are read-only for external consumers. Inheritance rules and the gate apply to every PR.</w:t>
-      </w:r>
-    </w:p>
-    <w:p>
-      <w:r>
-        <w:pict>
-          <v:rect style="width:0;height:1.5pt" o:hralign="center" o:hrstd="t" o:hr="t"/>
-        </w:pict>
-      </w:r>
-    </w:p>
-    <w:bookmarkEnd w:id="56"/>
-    <w:bookmarkStart w:id="60" w:name="sources-verified"/>
-    <w:p>
-      <w:pPr>
-        <w:pStyle w:val="Heading2"/>
-      </w:pPr>
-      <w:r>
-        <w:t xml:space="preserve">Sources verified</w:t>
-      </w:r>
-    </w:p>
-    <w:p>
-      <w:pPr>
-        <w:pStyle w:val="FirstParagraph"/>
-      </w:pPr>
-      <w:r>
-        <w:t xml:space="preserve">Per HelixConstitution §11.4.99 + Herald §108.n (Latest-Source Documentation Cross-Reference Mandate). This README is a gateway document — the substantive operator-facing instructions live in the per-channel / per-dispatcher guides linked above. Each linked guide carries its own</w:t>
-      </w:r>
-      <w:r>
-        <w:t xml:space="preserve"> </w:t>
-      </w:r>
-      <w:r>
-        <w:rPr>
-          <w:rStyle w:val="VerbatimChar"/>
-        </w:rPr>
-        <w:t xml:space="preserve">## Sources verified</w:t>
-      </w:r>
-      <w:r>
-        <w:t xml:space="preserve"> </w:t>
-      </w:r>
-      <w:r>
-        <w:t xml:space="preserve">footer covering the external services it documents. The cross-references below cover the external claims this README makes directly.</w:t>
-      </w:r>
-    </w:p>
-    <w:p>
-      <w:pPr>
-        <w:pStyle w:val="BodyText"/>
-      </w:pPr>
-      <w:r>
-        <w:rPr>
-          <w:b/>
-          <w:bCs/>
-        </w:rPr>
-        <w:t xml:space="preserve">Last verified:</w:t>
-      </w:r>
-      <w:r>
-        <w:t xml:space="preserve"> </w:t>
-      </w:r>
-      <w:r>
-        <w:t xml:space="preserve">2026-05-28</w:t>
+        <w:t xml:space="preserve">, documenting every subcommand the built binary surfaces (</w:t>
+      </w:r>
+      <w:r>
+        <w:rPr>
+          <w:rStyle w:val="VerbatimChar"/>
+        </w:rPr>
+        <w:t xml:space="preserve">&lt;flavor&gt; --help</w:t>
+      </w:r>
+      <w:r>
+        <w:t xml:space="preserve">), the env/credentials each needs, real example invocations, and which subcommands are live vs not-yet-implemented (all anti-bluff — derived from running the actual binary, nothing invented).</w:t>
       </w:r>
     </w:p>
     <w:tbl>
@@ -3775,6 +3044,1603 @@
               <w:pStyle w:val="Compact"/>
             </w:pPr>
             <w:r>
+              <w:t xml:space="preserve">Flavor</w:t>
+            </w:r>
+          </w:p>
+        </w:tc>
+        <w:tc>
+          <w:tcPr/>
+          <w:p>
+            <w:pPr>
+              <w:pStyle w:val="Compact"/>
+            </w:pPr>
+            <w:r>
+              <w:t xml:space="preserve">Role</w:t>
+            </w:r>
+          </w:p>
+        </w:tc>
+        <w:tc>
+          <w:tcPr/>
+          <w:p>
+            <w:pPr>
+              <w:pStyle w:val="Compact"/>
+            </w:pPr>
+            <w:r>
+              <w:t xml:space="preserve">Guide</w:t>
+            </w:r>
+          </w:p>
+        </w:tc>
+      </w:tr>
+      <w:tr>
+        <w:tc>
+          <w:tcPr/>
+          <w:p>
+            <w:pPr>
+              <w:pStyle w:val="Compact"/>
+            </w:pPr>
+            <w:r>
+              <w:rPr>
+                <w:rStyle w:val="VerbatimChar"/>
+              </w:rPr>
+              <w:t xml:space="preserve">pherald</w:t>
+            </w:r>
+          </w:p>
+        </w:tc>
+        <w:tc>
+          <w:tcPr/>
+          <w:p>
+            <w:pPr>
+              <w:pStyle w:val="Compact"/>
+            </w:pPr>
+            <w:r>
+              <w:t xml:space="preserve">Project Herald — the richest flavor:</w:t>
+            </w:r>
+            <w:r>
+              <w:t xml:space="preserve"> </w:t>
+            </w:r>
+            <w:r>
+              <w:rPr>
+                <w:rStyle w:val="VerbatimChar"/>
+              </w:rPr>
+              <w:t xml:space="preserve">serve</w:t>
+            </w:r>
+            <w:r>
+              <w:t xml:space="preserve">/</w:t>
+            </w:r>
+            <w:r>
+              <w:rPr>
+                <w:rStyle w:val="VerbatimChar"/>
+              </w:rPr>
+              <w:t xml:space="preserve">listen</w:t>
+            </w:r>
+            <w:r>
+              <w:t xml:space="preserve">/</w:t>
+            </w:r>
+            <w:r>
+              <w:rPr>
+                <w:rStyle w:val="VerbatimChar"/>
+              </w:rPr>
+              <w:t xml:space="preserve">watch</w:t>
+            </w:r>
+            <w:r>
+              <w:t xml:space="preserve">/</w:t>
+            </w:r>
+            <w:r>
+              <w:rPr>
+                <w:rStyle w:val="VerbatimChar"/>
+              </w:rPr>
+              <w:t xml:space="preserve">migrate</w:t>
+            </w:r>
+            <w:r>
+              <w:t xml:space="preserve">/</w:t>
+            </w:r>
+            <w:r>
+              <w:rPr>
+                <w:rStyle w:val="VerbatimChar"/>
+              </w:rPr>
+              <w:t xml:space="preserve">wizard</w:t>
+            </w:r>
+            <w:r>
+              <w:t xml:space="preserve">/</w:t>
+            </w:r>
+            <w:r>
+              <w:rPr>
+                <w:rStyle w:val="VerbatimChar"/>
+              </w:rPr>
+              <w:t xml:space="preserve">commit-push</w:t>
+            </w:r>
+            <w:r>
+              <w:t xml:space="preserve"> </w:t>
+            </w:r>
+            <w:r>
+              <w:t xml:space="preserve">+ the §43 GitOps commands</w:t>
+            </w:r>
+          </w:p>
+        </w:tc>
+        <w:tc>
+          <w:tcPr/>
+          <w:p>
+            <w:pPr>
+              <w:pStyle w:val="Compact"/>
+            </w:pPr>
+            <w:hyperlink r:id="rId47">
+              <w:r>
+                <w:rPr>
+                  <w:rStyle w:val="VerbatimChar"/>
+                </w:rPr>
+                <w:t xml:space="preserve">docs/guides/PHERALD.md</w:t>
+              </w:r>
+            </w:hyperlink>
+          </w:p>
+        </w:tc>
+      </w:tr>
+      <w:tr>
+        <w:tc>
+          <w:tcPr/>
+          <w:p>
+            <w:pPr>
+              <w:pStyle w:val="Compact"/>
+            </w:pPr>
+            <w:r>
+              <w:rPr>
+                <w:rStyle w:val="VerbatimChar"/>
+              </w:rPr>
+              <w:t xml:space="preserve">sherald</w:t>
+            </w:r>
+          </w:p>
+        </w:tc>
+        <w:tc>
+          <w:tcPr/>
+          <w:p>
+            <w:pPr>
+              <w:pStyle w:val="Compact"/>
+            </w:pPr>
+            <w:r>
+              <w:t xml:space="preserve">System Herald —</w:t>
+            </w:r>
+            <w:r>
+              <w:t xml:space="preserve"> </w:t>
+            </w:r>
+            <w:r>
+              <w:rPr>
+                <w:rStyle w:val="VerbatimChar"/>
+              </w:rPr>
+              <w:t xml:space="preserve">serve</w:t>
+            </w:r>
+            <w:r>
+              <w:t xml:space="preserve"> </w:t>
+            </w:r>
+            <w:r>
+              <w:t xml:space="preserve">(</w:t>
+            </w:r>
+            <w:r>
+              <w:rPr>
+                <w:rStyle w:val="VerbatimChar"/>
+              </w:rPr>
+              <w:t xml:space="preserve">/v1/safety_state</w:t>
+            </w:r>
+            <w:r>
+              <w:t xml:space="preserve">) + the host-safety guard commands (</w:t>
+            </w:r>
+            <w:r>
+              <w:rPr>
+                <w:rStyle w:val="VerbatimChar"/>
+              </w:rPr>
+              <w:t xml:space="preserve">destructive-guard</w:t>
+            </w:r>
+            <w:r>
+              <w:t xml:space="preserve">,</w:t>
+            </w:r>
+            <w:r>
+              <w:t xml:space="preserve"> </w:t>
+            </w:r>
+            <w:r>
+              <w:rPr>
+                <w:rStyle w:val="VerbatimChar"/>
+              </w:rPr>
+              <w:t xml:space="preserve">force-push-gate</w:t>
+            </w:r>
+            <w:r>
+              <w:t xml:space="preserve">,</w:t>
+            </w:r>
+            <w:r>
+              <w:t xml:space="preserve"> </w:t>
+            </w:r>
+            <w:r>
+              <w:rPr>
+                <w:rStyle w:val="VerbatimChar"/>
+              </w:rPr>
+              <w:t xml:space="preserve">mem-budget-watch</w:t>
+            </w:r>
+            <w:r>
+              <w:t xml:space="preserve">,</w:t>
+            </w:r>
+            <w:r>
+              <w:t xml:space="preserve"> </w:t>
+            </w:r>
+            <w:r>
+              <w:rPr>
+                <w:rStyle w:val="VerbatimChar"/>
+              </w:rPr>
+              <w:t xml:space="preserve">backup-snapshot</w:t>
+            </w:r>
+            <w:r>
+              <w:t xml:space="preserve">,</w:t>
+            </w:r>
+            <w:r>
+              <w:t xml:space="preserve"> </w:t>
+            </w:r>
+            <w:r>
+              <w:rPr>
+                <w:rStyle w:val="VerbatimChar"/>
+              </w:rPr>
+              <w:t xml:space="preserve">sysctl</w:t>
+            </w:r>
+            <w:r>
+              <w:t xml:space="preserve">)</w:t>
+            </w:r>
+          </w:p>
+        </w:tc>
+        <w:tc>
+          <w:tcPr/>
+          <w:p>
+            <w:pPr>
+              <w:pStyle w:val="Compact"/>
+            </w:pPr>
+            <w:hyperlink r:id="rId48">
+              <w:r>
+                <w:rPr>
+                  <w:rStyle w:val="VerbatimChar"/>
+                </w:rPr>
+                <w:t xml:space="preserve">docs/guides/SHERALD.md</w:t>
+              </w:r>
+            </w:hyperlink>
+          </w:p>
+        </w:tc>
+      </w:tr>
+      <w:tr>
+        <w:tc>
+          <w:tcPr/>
+          <w:p>
+            <w:pPr>
+              <w:pStyle w:val="Compact"/>
+            </w:pPr>
+            <w:r>
+              <w:rPr>
+                <w:rStyle w:val="VerbatimChar"/>
+              </w:rPr>
+              <w:t xml:space="preserve">cherald</w:t>
+            </w:r>
+          </w:p>
+        </w:tc>
+        <w:tc>
+          <w:tcPr/>
+          <w:p>
+            <w:pPr>
+              <w:pStyle w:val="Compact"/>
+            </w:pPr>
+            <w:r>
+              <w:t xml:space="preserve">Constitution Herald —</w:t>
+            </w:r>
+            <w:r>
+              <w:t xml:space="preserve"> </w:t>
+            </w:r>
+            <w:r>
+              <w:rPr>
+                <w:rStyle w:val="VerbatimChar"/>
+              </w:rPr>
+              <w:t xml:space="preserve">serve</w:t>
+            </w:r>
+            <w:r>
+              <w:t xml:space="preserve"> </w:t>
+            </w:r>
+            <w:r>
+              <w:t xml:space="preserve">(</w:t>
+            </w:r>
+            <w:r>
+              <w:rPr>
+                <w:rStyle w:val="VerbatimChar"/>
+              </w:rPr>
+              <w:t xml:space="preserve">/v1/compliance</w:t>
+            </w:r>
+            <w:r>
+              <w:t xml:space="preserve">) + the §11.4 compliance-check catalogue (</w:t>
+            </w:r>
+            <w:r>
+              <w:rPr>
+                <w:rStyle w:val="VerbatimChar"/>
+              </w:rPr>
+              <w:t xml:space="preserve">creds-scan</w:t>
+            </w:r>
+            <w:r>
+              <w:t xml:space="preserve">,</w:t>
+            </w:r>
+            <w:r>
+              <w:t xml:space="preserve"> </w:t>
+            </w:r>
+            <w:r>
+              <w:rPr>
+                <w:rStyle w:val="VerbatimChar"/>
+              </w:rPr>
+              <w:t xml:space="preserve">docs-sync</w:t>
+            </w:r>
+            <w:r>
+              <w:t xml:space="preserve">,</w:t>
+            </w:r>
+            <w:r>
+              <w:t xml:space="preserve"> </w:t>
+            </w:r>
+            <w:r>
+              <w:rPr>
+                <w:rStyle w:val="VerbatimChar"/>
+              </w:rPr>
+              <w:t xml:space="preserve">composite-gate</w:t>
+            </w:r>
+            <w:r>
+              <w:t xml:space="preserve">,</w:t>
+            </w:r>
+            <w:r>
+              <w:t xml:space="preserve"> </w:t>
+            </w:r>
+            <w:r>
+              <w:rPr>
+                <w:rStyle w:val="VerbatimChar"/>
+              </w:rPr>
+              <w:t xml:space="preserve">readme-sync</w:t>
+            </w:r>
+            <w:r>
+              <w:t xml:space="preserve">, …)</w:t>
+            </w:r>
+          </w:p>
+        </w:tc>
+        <w:tc>
+          <w:tcPr/>
+          <w:p>
+            <w:pPr>
+              <w:pStyle w:val="Compact"/>
+            </w:pPr>
+            <w:hyperlink r:id="rId49">
+              <w:r>
+                <w:rPr>
+                  <w:rStyle w:val="VerbatimChar"/>
+                </w:rPr>
+                <w:t xml:space="preserve">docs/guides/CHERALD.md</w:t>
+              </w:r>
+            </w:hyperlink>
+          </w:p>
+        </w:tc>
+      </w:tr>
+      <w:tr>
+        <w:tc>
+          <w:tcPr/>
+          <w:p>
+            <w:pPr>
+              <w:pStyle w:val="Compact"/>
+            </w:pPr>
+            <w:r>
+              <w:rPr>
+                <w:rStyle w:val="VerbatimChar"/>
+              </w:rPr>
+              <w:t xml:space="preserve">bherald</w:t>
+            </w:r>
+          </w:p>
+        </w:tc>
+        <w:tc>
+          <w:tcPr/>
+          <w:p>
+            <w:pPr>
+              <w:pStyle w:val="Compact"/>
+            </w:pPr>
+            <w:r>
+              <w:t xml:space="preserve">Build Herald — CLI-only CI/test gates:</w:t>
+            </w:r>
+            <w:r>
+              <w:t xml:space="preserve"> </w:t>
+            </w:r>
+            <w:r>
+              <w:rPr>
+                <w:rStyle w:val="VerbatimChar"/>
+              </w:rPr>
+              <w:t xml:space="preserve">evidence-capture</w:t>
+            </w:r>
+            <w:r>
+              <w:t xml:space="preserve"> </w:t>
+            </w:r>
+            <w:r>
+              <w:t xml:space="preserve">(§11.4.2) +</w:t>
+            </w:r>
+            <w:r>
+              <w:t xml:space="preserve"> </w:t>
+            </w:r>
+            <w:r>
+              <w:rPr>
+                <w:rStyle w:val="VerbatimChar"/>
+              </w:rPr>
+              <w:t xml:space="preserve">test-tier-verify</w:t>
+            </w:r>
+            <w:r>
+              <w:t xml:space="preserve"> </w:t>
+            </w:r>
+            <w:r>
+              <w:t xml:space="preserve">(§40.2 8-tier matrix);</w:t>
+            </w:r>
+            <w:r>
+              <w:t xml:space="preserve"> </w:t>
+            </w:r>
+            <w:r>
+              <w:rPr>
+                <w:rStyle w:val="VerbatimChar"/>
+              </w:rPr>
+              <w:t xml:space="preserve">gate-retest</w:t>
+            </w:r>
+            <w:r>
+              <w:t xml:space="preserve"> </w:t>
+            </w:r>
+            <w:r>
+              <w:t xml:space="preserve">not-yet-implemented (HRD-045)</w:t>
+            </w:r>
+          </w:p>
+        </w:tc>
+        <w:tc>
+          <w:tcPr/>
+          <w:p>
+            <w:pPr>
+              <w:pStyle w:val="Compact"/>
+            </w:pPr>
+            <w:hyperlink r:id="rId50">
+              <w:r>
+                <w:rPr>
+                  <w:rStyle w:val="VerbatimChar"/>
+                </w:rPr>
+                <w:t xml:space="preserve">docs/guides/BHERALD.md</w:t>
+              </w:r>
+            </w:hyperlink>
+          </w:p>
+        </w:tc>
+      </w:tr>
+      <w:tr>
+        <w:tc>
+          <w:tcPr/>
+          <w:p>
+            <w:pPr>
+              <w:pStyle w:val="Compact"/>
+            </w:pPr>
+            <w:r>
+              <w:rPr>
+                <w:rStyle w:val="VerbatimChar"/>
+              </w:rPr>
+              <w:t xml:space="preserve">rherald</w:t>
+            </w:r>
+          </w:p>
+        </w:tc>
+        <w:tc>
+          <w:tcPr/>
+          <w:p>
+            <w:pPr>
+              <w:pStyle w:val="Compact"/>
+            </w:pPr>
+            <w:r>
+              <w:t xml:space="preserve">Release Herald — CLI-only release path:</w:t>
+            </w:r>
+            <w:r>
+              <w:t xml:space="preserve"> </w:t>
+            </w:r>
+            <w:r>
+              <w:rPr>
+                <w:rStyle w:val="VerbatimChar"/>
+              </w:rPr>
+              <w:t xml:space="preserve">changelog-generate</w:t>
+            </w:r>
+            <w:r>
+              <w:t xml:space="preserve"> </w:t>
+            </w:r>
+            <w:r>
+              <w:t xml:space="preserve">(§5),</w:t>
+            </w:r>
+            <w:r>
+              <w:t xml:space="preserve"> </w:t>
+            </w:r>
+            <w:r>
+              <w:rPr>
+                <w:rStyle w:val="VerbatimChar"/>
+              </w:rPr>
+              <w:t xml:space="preserve">tag-mirror</w:t>
+            </w:r>
+            <w:r>
+              <w:t xml:space="preserve"> </w:t>
+            </w:r>
+            <w:r>
+              <w:t xml:space="preserve">(§4 cross-mirror parity),</w:t>
+            </w:r>
+            <w:r>
+              <w:t xml:space="preserve"> </w:t>
+            </w:r>
+            <w:r>
+              <w:rPr>
+                <w:rStyle w:val="VerbatimChar"/>
+              </w:rPr>
+              <w:t xml:space="preserve">gate-retest</w:t>
+            </w:r>
+            <w:r>
+              <w:t xml:space="preserve"> </w:t>
+            </w:r>
+            <w:r>
+              <w:t xml:space="preserve">(§11.4.40 pre-tag retest)</w:t>
+            </w:r>
+          </w:p>
+        </w:tc>
+        <w:tc>
+          <w:tcPr/>
+          <w:p>
+            <w:pPr>
+              <w:pStyle w:val="Compact"/>
+            </w:pPr>
+            <w:hyperlink r:id="rId51">
+              <w:r>
+                <w:rPr>
+                  <w:rStyle w:val="VerbatimChar"/>
+                </w:rPr>
+                <w:t xml:space="preserve">docs/guides/RHERALD.md</w:t>
+              </w:r>
+            </w:hyperlink>
+          </w:p>
+        </w:tc>
+      </w:tr>
+      <w:tr>
+        <w:tc>
+          <w:tcPr/>
+          <w:p>
+            <w:pPr>
+              <w:pStyle w:val="Compact"/>
+            </w:pPr>
+            <w:r>
+              <w:rPr>
+                <w:rStyle w:val="VerbatimChar"/>
+              </w:rPr>
+              <w:t xml:space="preserve">iherald</w:t>
+            </w:r>
+          </w:p>
+        </w:tc>
+        <w:tc>
+          <w:tcPr/>
+          <w:p>
+            <w:pPr>
+              <w:pStyle w:val="Compact"/>
+            </w:pPr>
+            <w:r>
+              <w:t xml:space="preserve">Incident Herald —</w:t>
+            </w:r>
+            <w:r>
+              <w:t xml:space="preserve"> </w:t>
+            </w:r>
+            <w:r>
+              <w:rPr>
+                <w:rStyle w:val="VerbatimChar"/>
+              </w:rPr>
+              <w:t xml:space="preserve">serve</w:t>
+            </w:r>
+            <w:r>
+              <w:t xml:space="preserve">;</w:t>
+            </w:r>
+            <w:r>
+              <w:t xml:space="preserve"> </w:t>
+            </w:r>
+            <w:r>
+              <w:rPr>
+                <w:rStyle w:val="VerbatimChar"/>
+              </w:rPr>
+              <w:t xml:space="preserve">/v1/webhooks/page</w:t>
+            </w:r>
+            <w:r>
+              <w:t xml:space="preserve"> </w:t>
+            </w:r>
+            <w:r>
+              <w:t xml:space="preserve">is an honest 501 stub pending HRD-024</w:t>
+            </w:r>
+          </w:p>
+        </w:tc>
+        <w:tc>
+          <w:tcPr/>
+          <w:p>
+            <w:pPr>
+              <w:pStyle w:val="Compact"/>
+            </w:pPr>
+            <w:hyperlink r:id="rId52">
+              <w:r>
+                <w:rPr>
+                  <w:rStyle w:val="VerbatimChar"/>
+                </w:rPr>
+                <w:t xml:space="preserve">docs/guides/IHERALD.md</w:t>
+              </w:r>
+            </w:hyperlink>
+          </w:p>
+        </w:tc>
+      </w:tr>
+      <w:tr>
+        <w:tc>
+          <w:tcPr/>
+          <w:p>
+            <w:pPr>
+              <w:pStyle w:val="Compact"/>
+            </w:pPr>
+            <w:r>
+              <w:rPr>
+                <w:rStyle w:val="VerbatimChar"/>
+              </w:rPr>
+              <w:t xml:space="preserve">scherald</w:t>
+            </w:r>
+          </w:p>
+        </w:tc>
+        <w:tc>
+          <w:tcPr/>
+          <w:p>
+            <w:pPr>
+              <w:pStyle w:val="Compact"/>
+            </w:pPr>
+            <w:r>
+              <w:t xml:space="preserve">Status-Check Herald — CLI-only</w:t>
+            </w:r>
+            <w:r>
+              <w:t xml:space="preserve"> </w:t>
+            </w:r>
+            <w:r>
+              <w:rPr>
+                <w:rStyle w:val="VerbatimChar"/>
+              </w:rPr>
+              <w:t xml:space="preserve">status-digest</w:t>
+            </w:r>
+            <w:r>
+              <w:t xml:space="preserve"> </w:t>
+            </w:r>
+            <w:r>
+              <w:t xml:space="preserve">(§11.4.45 rollup)</w:t>
+            </w:r>
+          </w:p>
+        </w:tc>
+        <w:tc>
+          <w:tcPr/>
+          <w:p>
+            <w:pPr>
+              <w:pStyle w:val="Compact"/>
+            </w:pPr>
+            <w:hyperlink r:id="rId53">
+              <w:r>
+                <w:rPr>
+                  <w:rStyle w:val="VerbatimChar"/>
+                </w:rPr>
+                <w:t xml:space="preserve">docs/guides/SCHERALD.md</w:t>
+              </w:r>
+            </w:hyperlink>
+          </w:p>
+        </w:tc>
+      </w:tr>
+      <w:tr>
+        <w:tc>
+          <w:tcPr/>
+          <w:p>
+            <w:pPr>
+              <w:pStyle w:val="Compact"/>
+            </w:pPr>
+            <w:r>
+              <w:rPr>
+                <w:rStyle w:val="VerbatimChar"/>
+              </w:rPr>
+              <w:t xml:space="preserve">qaherald</w:t>
+            </w:r>
+          </w:p>
+        </w:tc>
+        <w:tc>
+          <w:tcPr/>
+          <w:p>
+            <w:pPr>
+              <w:pStyle w:val="Compact"/>
+            </w:pPr>
+            <w:r>
+              <w:t xml:space="preserve">QA Herald — Herald's autonomous QA bot:</w:t>
+            </w:r>
+            <w:r>
+              <w:t xml:space="preserve"> </w:t>
+            </w:r>
+            <w:r>
+              <w:rPr>
+                <w:rStyle w:val="VerbatimChar"/>
+              </w:rPr>
+              <w:t xml:space="preserve">run</w:t>
+            </w:r>
+            <w:r>
+              <w:t xml:space="preserve"> </w:t>
+            </w:r>
+            <w:r>
+              <w:t xml:space="preserve">(scenario harness → docs/qa evidence),</w:t>
+            </w:r>
+            <w:r>
+              <w:t xml:space="preserve"> </w:t>
+            </w:r>
+            <w:r>
+              <w:rPr>
+                <w:rStyle w:val="VerbatimChar"/>
+              </w:rPr>
+              <w:t xml:space="preserve">mtproto</w:t>
+            </w:r>
+            <w:r>
+              <w:t xml:space="preserve"> </w:t>
+            </w:r>
+            <w:r>
+              <w:t xml:space="preserve">session lifecycle (</w:t>
+            </w:r>
+            <w:r>
+              <w:rPr>
+                <w:rStyle w:val="VerbatimChar"/>
+              </w:rPr>
+              <w:t xml:space="preserve">login</w:t>
+            </w:r>
+            <w:r>
+              <w:t xml:space="preserve">/</w:t>
+            </w:r>
+            <w:r>
+              <w:rPr>
+                <w:rStyle w:val="VerbatimChar"/>
+              </w:rPr>
+              <w:t xml:space="preserve">whoami</w:t>
+            </w:r>
+            <w:r>
+              <w:t xml:space="preserve">/</w:t>
+            </w:r>
+            <w:r>
+              <w:rPr>
+                <w:rStyle w:val="VerbatimChar"/>
+              </w:rPr>
+              <w:t xml:space="preserve">logout</w:t>
+            </w:r>
+            <w:r>
+              <w:t xml:space="preserve">),</w:t>
+            </w:r>
+            <w:r>
+              <w:t xml:space="preserve"> </w:t>
+            </w:r>
+            <w:r>
+              <w:rPr>
+                <w:rStyle w:val="VerbatimChar"/>
+              </w:rPr>
+              <w:t xml:space="preserve">lifecycle</w:t>
+            </w:r>
+            <w:r>
+              <w:t xml:space="preserve"> </w:t>
+            </w:r>
+            <w:r>
+              <w:t xml:space="preserve">(15-scenario driver, SKELETON)</w:t>
+            </w:r>
+          </w:p>
+        </w:tc>
+        <w:tc>
+          <w:tcPr/>
+          <w:p>
+            <w:pPr>
+              <w:pStyle w:val="Compact"/>
+            </w:pPr>
+            <w:hyperlink r:id="rId54">
+              <w:r>
+                <w:rPr>
+                  <w:rStyle w:val="VerbatimChar"/>
+                </w:rPr>
+                <w:t xml:space="preserve">docs/guides/QAHERALD.md</w:t>
+              </w:r>
+            </w:hyperlink>
+          </w:p>
+        </w:tc>
+      </w:tr>
+    </w:tbl>
+    <w:bookmarkEnd w:id="55"/>
+    <w:bookmarkStart w:id="57" w:name="credentials-master-guide"/>
+    <w:p>
+      <w:pPr>
+        <w:pStyle w:val="Heading3"/>
+      </w:pPr>
+      <w:r>
+        <w:t xml:space="preserve">Credentials master guide</w:t>
+      </w:r>
+    </w:p>
+    <w:p>
+      <w:pPr>
+        <w:pStyle w:val="FirstParagraph"/>
+      </w:pPr>
+      <w:hyperlink r:id="rId56">
+        <w:r>
+          <w:rPr>
+            <w:rStyle w:val="VerbatimChar"/>
+          </w:rPr>
+          <w:t xml:space="preserve">docs/guides/OPERATOR_CREDENTIALS.md</w:t>
+        </w:r>
+      </w:hyperlink>
+      <w:r>
+        <w:t xml:space="preserve"> </w:t>
+      </w:r>
+      <w:r>
+        <w:t xml:space="preserve">is the umbrella reference covering:</w:t>
+      </w:r>
+    </w:p>
+    <w:p>
+      <w:pPr>
+        <w:pStyle w:val="Compact"/>
+        <w:numPr>
+          <w:ilvl w:val="0"/>
+          <w:numId w:val="1009"/>
+        </w:numPr>
+      </w:pPr>
+      <w:r>
+        <w:t xml:space="preserve">The 12-factor resolution order (CLI flag &gt; shell exports &gt;</w:t>
+      </w:r>
+      <w:r>
+        <w:t xml:space="preserve"> </w:t>
+      </w:r>
+      <w:r>
+        <w:rPr>
+          <w:rStyle w:val="VerbatimChar"/>
+        </w:rPr>
+        <w:t xml:space="preserve">.env</w:t>
+      </w:r>
+      <w:r>
+        <w:t xml:space="preserve"> </w:t>
+      </w:r>
+      <w:r>
+        <w:t xml:space="preserve">&gt; defaults)</w:t>
+      </w:r>
+    </w:p>
+    <w:p>
+      <w:pPr>
+        <w:pStyle w:val="Compact"/>
+        <w:numPr>
+          <w:ilvl w:val="0"/>
+          <w:numId w:val="1009"/>
+        </w:numPr>
+      </w:pPr>
+      <w:r>
+        <w:t xml:space="preserve">How to set credentials via</w:t>
+      </w:r>
+      <w:r>
+        <w:t xml:space="preserve"> </w:t>
+      </w:r>
+      <w:r>
+        <w:rPr>
+          <w:rStyle w:val="VerbatimChar"/>
+        </w:rPr>
+        <w:t xml:space="preserve">~/.bashrc</w:t>
+      </w:r>
+      <w:r>
+        <w:t xml:space="preserve"> </w:t>
+      </w:r>
+      <w:r>
+        <w:t xml:space="preserve">/</w:t>
+      </w:r>
+      <w:r>
+        <w:t xml:space="preserve"> </w:t>
+      </w:r>
+      <w:r>
+        <w:rPr>
+          <w:rStyle w:val="VerbatimChar"/>
+        </w:rPr>
+        <w:t xml:space="preserve">~/.zshrc</w:t>
+      </w:r>
+      <w:r>
+        <w:t xml:space="preserve"> </w:t>
+      </w:r>
+      <w:r>
+        <w:t xml:space="preserve">(shell-export path) AND</w:t>
+      </w:r>
+      <w:r>
+        <w:t xml:space="preserve"> </w:t>
+      </w:r>
+      <w:r>
+        <w:rPr>
+          <w:rStyle w:val="VerbatimChar"/>
+        </w:rPr>
+        <w:t xml:space="preserve">.env</w:t>
+      </w:r>
+      <w:r>
+        <w:t xml:space="preserve"> </w:t>
+      </w:r>
+      <w:r>
+        <w:t xml:space="preserve">(project-local path) — both supported per spec V3 §3.3</w:t>
+      </w:r>
+    </w:p>
+    <w:p>
+      <w:pPr>
+        <w:pStyle w:val="Compact"/>
+        <w:numPr>
+          <w:ilvl w:val="0"/>
+          <w:numId w:val="1009"/>
+        </w:numPr>
+      </w:pPr>
+      <w:r>
+        <w:t xml:space="preserve">Pre-commit secrets audit checklist (</w:t>
+      </w:r>
+      <w:r>
+        <w:rPr>
+          <w:rStyle w:val="VerbatimChar"/>
+        </w:rPr>
+        <w:t xml:space="preserve">.env</w:t>
+      </w:r>
+      <w:r>
+        <w:t xml:space="preserve"> </w:t>
+      </w:r>
+      <w:r>
+        <w:t xml:space="preserve">not tracked; no obvious-format secrets;</w:t>
+      </w:r>
+      <w:r>
+        <w:t xml:space="preserve"> </w:t>
+      </w:r>
+      <w:r>
+        <w:rPr>
+          <w:rStyle w:val="VerbatimChar"/>
+        </w:rPr>
+        <w:t xml:space="preserve">.env.example</w:t>
+      </w:r>
+      <w:r>
+        <w:t xml:space="preserve"> </w:t>
+      </w:r>
+      <w:r>
+        <w:t xml:space="preserve">only has placeholders)</w:t>
+      </w:r>
+    </w:p>
+    <w:p>
+      <w:pPr>
+        <w:pStyle w:val="Compact"/>
+        <w:numPr>
+          <w:ilvl w:val="0"/>
+          <w:numId w:val="1009"/>
+        </w:numPr>
+      </w:pPr>
+      <w:r>
+        <w:t xml:space="preserve">Quickstart-compose vs native pherald operating modes</w:t>
+      </w:r>
+    </w:p>
+    <w:p>
+      <w:pPr>
+        <w:pStyle w:val="Compact"/>
+        <w:numPr>
+          <w:ilvl w:val="0"/>
+          <w:numId w:val="1009"/>
+        </w:numPr>
+      </w:pPr>
+      <w:r>
+        <w:t xml:space="preserve">Troubleshooting (SQLSTATE 28P01, "DSN not set", SKIP-with-reason logic per §11.4.3, …)</w:t>
+      </w:r>
+    </w:p>
+    <w:p>
+      <w:pPr>
+        <w:pStyle w:val="FirstParagraph"/>
+      </w:pPr>
+      <w:r>
+        <w:t xml:space="preserve">Per Universal Constitution §11.4.10:</w:t>
+      </w:r>
+      <w:r>
+        <w:t xml:space="preserve"> </w:t>
+      </w:r>
+      <w:r>
+        <w:rPr>
+          <w:rStyle w:val="VerbatimChar"/>
+          <w:b/>
+          <w:bCs/>
+        </w:rPr>
+        <w:t xml:space="preserve">.env</w:t>
+      </w:r>
+      <w:r>
+        <w:rPr>
+          <w:b/>
+          <w:bCs/>
+        </w:rPr>
+        <w:t xml:space="preserve"> </w:t>
+      </w:r>
+      <w:r>
+        <w:rPr>
+          <w:b/>
+          <w:bCs/>
+        </w:rPr>
+        <w:t xml:space="preserve">files MUST NEVER be committed</w:t>
+      </w:r>
+      <w:r>
+        <w:t xml:space="preserve">. The repo's</w:t>
+      </w:r>
+      <w:r>
+        <w:t xml:space="preserve"> </w:t>
+      </w:r>
+      <w:r>
+        <w:rPr>
+          <w:rStyle w:val="VerbatimChar"/>
+        </w:rPr>
+        <w:t xml:space="preserve">.gitignore</w:t>
+      </w:r>
+      <w:r>
+        <w:t xml:space="preserve"> </w:t>
+      </w:r>
+      <w:r>
+        <w:t xml:space="preserve">already covers</w:t>
+      </w:r>
+      <w:r>
+        <w:t xml:space="preserve"> </w:t>
+      </w:r>
+      <w:r>
+        <w:rPr>
+          <w:rStyle w:val="VerbatimChar"/>
+        </w:rPr>
+        <w:t xml:space="preserve">.env</w:t>
+      </w:r>
+      <w:r>
+        <w:t xml:space="preserve">. The committed</w:t>
+      </w:r>
+      <w:r>
+        <w:t xml:space="preserve"> </w:t>
+      </w:r>
+      <w:r>
+        <w:rPr>
+          <w:rStyle w:val="VerbatimChar"/>
+        </w:rPr>
+        <w:t xml:space="preserve">quickstart/.env.example</w:t>
+      </w:r>
+      <w:r>
+        <w:t xml:space="preserve"> </w:t>
+      </w:r>
+      <w:r>
+        <w:t xml:space="preserve">is the only credentials-file that lives in git, and it contains only placeholder values.</w:t>
+      </w:r>
+    </w:p>
+    <w:bookmarkEnd w:id="57"/>
+    <w:bookmarkStart w:id="60" w:name="X2d57ec4c52902418777a57d1b6587fe0de5df6e"/>
+    <w:p>
+      <w:pPr>
+        <w:pStyle w:val="Heading3"/>
+      </w:pPr>
+      <w:r>
+        <w:t xml:space="preserve">Active blockers — operator action required</w:t>
+      </w:r>
+    </w:p>
+    <w:p>
+      <w:pPr>
+        <w:pStyle w:val="FirstParagraph"/>
+      </w:pPr>
+      <w:hyperlink r:id="rId58">
+        <w:r>
+          <w:rPr>
+            <w:rStyle w:val="VerbatimChar"/>
+          </w:rPr>
+          <w:t xml:space="preserve">docs/requirements/blockers/missing_env_variables.md</w:t>
+        </w:r>
+      </w:hyperlink>
+      <w:r>
+        <w:t xml:space="preserve"> </w:t>
+      </w:r>
+      <w:r>
+        <w:t xml:space="preserve">— the step-by-step MTProto credential setup the operator must complete to unblock Wave 8 Track B (the full-automation rewrite of</w:t>
+      </w:r>
+      <w:r>
+        <w:t xml:space="preserve"> </w:t>
+      </w:r>
+      <w:r>
+        <w:rPr>
+          <w:rStyle w:val="VerbatimChar"/>
+        </w:rPr>
+        <w:t xml:space="preserve">TestSubscribe_LiveBotAPI</w:t>
+      </w:r>
+      <w:r>
+        <w:t xml:space="preserve">,</w:t>
+      </w:r>
+      <w:r>
+        <w:t xml:space="preserve"> </w:t>
+      </w:r>
+      <w:r>
+        <w:rPr>
+          <w:rStyle w:val="VerbatimChar"/>
+        </w:rPr>
+        <w:t xml:space="preserve">tests/test_wave6_live_loop.sh</w:t>
+      </w:r>
+      <w:r>
+        <w:t xml:space="preserve">, and Wave 6.5 lifecycle scenarios per HelixConstitution §11.4.98 + Herald §108.m). Available in Markdown / HTML / PDF / DOCX.</w:t>
+      </w:r>
+      <w:r>
+        <w:t xml:space="preserve"> </w:t>
+      </w:r>
+      <w:r>
+        <w:rPr>
+          <w:b/>
+          <w:bCs/>
+        </w:rPr>
+        <w:t xml:space="preserve">Required for §11.4.98 compliance — release-gate item.</w:t>
+      </w:r>
+    </w:p>
+    <w:p>
+      <w:pPr>
+        <w:pStyle w:val="BodyText"/>
+      </w:pPr>
+      <w:hyperlink r:id="rId59">
+        <w:r>
+          <w:rPr>
+            <w:rStyle w:val="VerbatimChar"/>
+          </w:rPr>
+          <w:t xml:space="preserve">docs/audits/full-automation-114-98-audit-2026-05-28.md</w:t>
+        </w:r>
+      </w:hyperlink>
+      <w:r>
+        <w:t xml:space="preserve"> </w:t>
+      </w:r>
+      <w:r>
+        <w:t xml:space="preserve">— the canonical classification of every Herald test against §11.4.98 (794 tests audited: 758 COMPLIANT-hermetic, 32 COMPLIANT-with-creds-bootstrap, 4 NON-COMPLIANT-manual-dep, 1 STRUCTURALLY-BROKEN). NON-COMPLIANT items have until 2026-06-27 (T+30 days) to be rewritten before graduating to §11.4.90 Obsolete.</w:t>
+      </w:r>
+    </w:p>
+    <w:bookmarkEnd w:id="60"/>
+    <w:bookmarkEnd w:id="61"/>
+    <w:bookmarkStart w:id="62" w:name="mirror--push-convention"/>
+    <w:p>
+      <w:pPr>
+        <w:pStyle w:val="Heading2"/>
+      </w:pPr>
+      <w:r>
+        <w:t xml:space="preserve">Mirror &amp; push convention</w:t>
+      </w:r>
+    </w:p>
+    <w:p>
+      <w:pPr>
+        <w:pStyle w:val="FirstParagraph"/>
+      </w:pPr>
+      <w:r>
+        <w:t xml:space="preserve">Herald is mirrored to four hosts. The</w:t>
+      </w:r>
+      <w:r>
+        <w:t xml:space="preserve"> </w:t>
+      </w:r>
+      <w:r>
+        <w:rPr>
+          <w:rStyle w:val="VerbatimChar"/>
+        </w:rPr>
+        <w:t xml:space="preserve">origin</w:t>
+      </w:r>
+      <w:r>
+        <w:t xml:space="preserve"> </w:t>
+      </w:r>
+      <w:r>
+        <w:t xml:space="preserve">remote is</w:t>
+      </w:r>
+      <w:r>
+        <w:t xml:space="preserve"> </w:t>
+      </w:r>
+      <w:r>
+        <w:rPr>
+          <w:b/>
+          <w:bCs/>
+        </w:rPr>
+        <w:t xml:space="preserve">fan-out</w:t>
+      </w:r>
+      <w:r>
+        <w:t xml:space="preserve">: one fetch URL + four push URLs. A single</w:t>
+      </w:r>
+      <w:r>
+        <w:t xml:space="preserve"> </w:t>
+      </w:r>
+      <w:r>
+        <w:rPr>
+          <w:rStyle w:val="VerbatimChar"/>
+        </w:rPr>
+        <w:t xml:space="preserve">git push origin main</w:t>
+      </w:r>
+      <w:r>
+        <w:t xml:space="preserve"> </w:t>
+      </w:r>
+      <w:r>
+        <w:t xml:space="preserve">propagates to every mirror in one operation.</w:t>
+      </w:r>
+    </w:p>
+    <w:tbl>
+      <w:tblPr>
+        <w:tblStyle w:val="Table"/>
+        <w:tblW w:type="auto" w:w="0"/>
+        <w:tblLook w:firstRow="1" w:lastRow="0" w:firstColumn="0" w:lastColumn="0" w:noHBand="0" w:noVBand="0" w:val="0020"/>
+      </w:tblPr>
+      <w:tblGrid>
+        <w:gridCol w:w="3960"/>
+        <w:gridCol w:w="3960"/>
+      </w:tblGrid>
+      <w:tr>
+        <w:trPr>
+          <w:tblHeader w:val="on"/>
+        </w:trPr>
+        <w:tc>
+          <w:tcPr/>
+          <w:p>
+            <w:pPr>
+              <w:pStyle w:val="Compact"/>
+            </w:pPr>
+            <w:r>
+              <w:t xml:space="preserve">Remote name</w:t>
+            </w:r>
+          </w:p>
+        </w:tc>
+        <w:tc>
+          <w:tcPr/>
+          <w:p>
+            <w:pPr>
+              <w:pStyle w:val="Compact"/>
+            </w:pPr>
+            <w:r>
+              <w:t xml:space="preserve">URL</w:t>
+            </w:r>
+          </w:p>
+        </w:tc>
+      </w:tr>
+      <w:tr>
+        <w:tc>
+          <w:tcPr/>
+          <w:p>
+            <w:pPr>
+              <w:pStyle w:val="Compact"/>
+            </w:pPr>
+            <w:r>
+              <w:rPr>
+                <w:rStyle w:val="VerbatimChar"/>
+              </w:rPr>
+              <w:t xml:space="preserve">github</w:t>
+            </w:r>
+          </w:p>
+        </w:tc>
+        <w:tc>
+          <w:tcPr/>
+          <w:p>
+            <w:pPr>
+              <w:pStyle w:val="Compact"/>
+            </w:pPr>
+            <w:r>
+              <w:rPr>
+                <w:rStyle w:val="VerbatimChar"/>
+              </w:rPr>
+              <w:t xml:space="preserve">git@github.com:vasic-digital/Herald.git</w:t>
+            </w:r>
+          </w:p>
+        </w:tc>
+      </w:tr>
+      <w:tr>
+        <w:tc>
+          <w:tcPr/>
+          <w:p>
+            <w:pPr>
+              <w:pStyle w:val="Compact"/>
+            </w:pPr>
+            <w:r>
+              <w:rPr>
+                <w:rStyle w:val="VerbatimChar"/>
+              </w:rPr>
+              <w:t xml:space="preserve">gitlab</w:t>
+            </w:r>
+          </w:p>
+        </w:tc>
+        <w:tc>
+          <w:tcPr/>
+          <w:p>
+            <w:pPr>
+              <w:pStyle w:val="Compact"/>
+            </w:pPr>
+            <w:r>
+              <w:rPr>
+                <w:rStyle w:val="VerbatimChar"/>
+              </w:rPr>
+              <w:t xml:space="preserve">git@gitlab.com:vasic-digital/herald.git</w:t>
+            </w:r>
+          </w:p>
+        </w:tc>
+      </w:tr>
+      <w:tr>
+        <w:tc>
+          <w:tcPr/>
+          <w:p>
+            <w:pPr>
+              <w:pStyle w:val="Compact"/>
+            </w:pPr>
+            <w:r>
+              <w:rPr>
+                <w:rStyle w:val="VerbatimChar"/>
+              </w:rPr>
+              <w:t xml:space="preserve">gitflic</w:t>
+            </w:r>
+          </w:p>
+        </w:tc>
+        <w:tc>
+          <w:tcPr/>
+          <w:p>
+            <w:pPr>
+              <w:pStyle w:val="Compact"/>
+            </w:pPr>
+            <w:r>
+              <w:rPr>
+                <w:rStyle w:val="VerbatimChar"/>
+              </w:rPr>
+              <w:t xml:space="preserve">git@gitflic.ru:vasic-digital/herald.git</w:t>
+            </w:r>
+          </w:p>
+        </w:tc>
+      </w:tr>
+      <w:tr>
+        <w:tc>
+          <w:tcPr/>
+          <w:p>
+            <w:pPr>
+              <w:pStyle w:val="Compact"/>
+            </w:pPr>
+            <w:r>
+              <w:rPr>
+                <w:rStyle w:val="VerbatimChar"/>
+              </w:rPr>
+              <w:t xml:space="preserve">gitverse</w:t>
+            </w:r>
+          </w:p>
+        </w:tc>
+        <w:tc>
+          <w:tcPr/>
+          <w:p>
+            <w:pPr>
+              <w:pStyle w:val="Compact"/>
+            </w:pPr>
+            <w:r>
+              <w:rPr>
+                <w:rStyle w:val="VerbatimChar"/>
+              </w:rPr>
+              <w:t xml:space="preserve">git@gitverse.ru:vasic-digital/Herald.git</w:t>
+            </w:r>
+          </w:p>
+        </w:tc>
+      </w:tr>
+      <w:tr>
+        <w:tc>
+          <w:tcPr/>
+          <w:p>
+            <w:pPr>
+              <w:pStyle w:val="Compact"/>
+            </w:pPr>
+            <w:r>
+              <w:rPr>
+                <w:rStyle w:val="VerbatimChar"/>
+              </w:rPr>
+              <w:t xml:space="preserve">origin</w:t>
+            </w:r>
+          </w:p>
+        </w:tc>
+        <w:tc>
+          <w:tcPr/>
+          <w:p>
+            <w:pPr>
+              <w:pStyle w:val="Compact"/>
+            </w:pPr>
+            <w:r>
+              <w:t xml:space="preserve">(fetch from</w:t>
+            </w:r>
+            <w:r>
+              <w:t xml:space="preserve"> </w:t>
+            </w:r>
+            <w:r>
+              <w:rPr>
+                <w:rStyle w:val="VerbatimChar"/>
+              </w:rPr>
+              <w:t xml:space="preserve">github</w:t>
+            </w:r>
+            <w:r>
+              <w:t xml:space="preserve">; push fans out to all four)</w:t>
+            </w:r>
+          </w:p>
+        </w:tc>
+      </w:tr>
+    </w:tbl>
+    <w:p>
+      <w:pPr>
+        <w:pStyle w:val="BodyText"/>
+      </w:pPr>
+      <w:r>
+        <w:t xml:space="preserve">Each entry under</w:t>
+      </w:r>
+      <w:r>
+        <w:t xml:space="preserve"> </w:t>
+      </w:r>
+      <w:r>
+        <w:rPr>
+          <w:rStyle w:val="VerbatimChar"/>
+        </w:rPr>
+        <w:t xml:space="preserve">upstreams/</w:t>
+      </w:r>
+      <w:r>
+        <w:t xml:space="preserve"> </w:t>
+      </w:r>
+      <w:r>
+        <w:t xml:space="preserve">is a shell script that exports a single</w:t>
+      </w:r>
+      <w:r>
+        <w:t xml:space="preserve"> </w:t>
+      </w:r>
+      <w:r>
+        <w:rPr>
+          <w:rStyle w:val="VerbatimChar"/>
+        </w:rPr>
+        <w:t xml:space="preserve">UPSTREAMABLE_REPOSITORY=…</w:t>
+      </w:r>
+      <w:r>
+        <w:t xml:space="preserve"> </w:t>
+      </w:r>
+      <w:r>
+        <w:t xml:space="preserve">URL and is meant to be</w:t>
+      </w:r>
+      <w:r>
+        <w:t xml:space="preserve"> </w:t>
+      </w:r>
+      <w:r>
+        <w:rPr>
+          <w:b/>
+          <w:bCs/>
+        </w:rPr>
+        <w:t xml:space="preserve">sourced</w:t>
+      </w:r>
+      <w:r>
+        <w:t xml:space="preserve">, not executed for its output. Capitalization matches each host's brand (GitFlic, GitVerse); do not normalize to lowercase or collapse into one file — external mirror-push tooling keys on the per-file split.</w:t>
+      </w:r>
+    </w:p>
+    <w:p>
+      <w:pPr>
+        <w:pStyle w:val="BodyText"/>
+      </w:pPr>
+      <w:r>
+        <w:t xml:space="preserve">If you ever need to rebuild the fan-out configuration, the constitution submodule ships</w:t>
+      </w:r>
+      <w:r>
+        <w:t xml:space="preserve"> </w:t>
+      </w:r>
+      <w:r>
+        <w:rPr>
+          <w:rStyle w:val="VerbatimChar"/>
+        </w:rPr>
+        <w:t xml:space="preserve">install_upstreams.sh</w:t>
+      </w:r>
+      <w:r>
+        <w:t xml:space="preserve"> </w:t>
+      </w:r>
+      <w:r>
+        <w:t xml:space="preserve">that consumes</w:t>
+      </w:r>
+      <w:r>
+        <w:t xml:space="preserve"> </w:t>
+      </w:r>
+      <w:r>
+        <w:rPr>
+          <w:rStyle w:val="VerbatimChar"/>
+        </w:rPr>
+        <w:t xml:space="preserve">Upstreams/*.sh</w:t>
+      </w:r>
+      <w:r>
+        <w:t xml:space="preserve"> </w:t>
+      </w:r>
+      <w:r>
+        <w:t xml:space="preserve">declarations and configures git remotes accordingly; the same pattern can be adapted for Herald.</w:t>
+      </w:r>
+    </w:p>
+    <w:bookmarkEnd w:id="62"/>
+    <w:bookmarkStart w:id="64" w:name="license"/>
+    <w:p>
+      <w:pPr>
+        <w:pStyle w:val="Heading2"/>
+      </w:pPr>
+      <w:r>
+        <w:t xml:space="preserve">License</w:t>
+      </w:r>
+    </w:p>
+    <w:p>
+      <w:pPr>
+        <w:pStyle w:val="FirstParagraph"/>
+      </w:pPr>
+      <w:hyperlink r:id="rId63">
+        <w:r>
+          <w:rPr>
+            <w:rStyle w:val="VerbatimChar"/>
+          </w:rPr>
+          <w:t xml:space="preserve">LICENSE</w:t>
+        </w:r>
+      </w:hyperlink>
+      <w:r>
+        <w:t xml:space="preserve"> </w:t>
+      </w:r>
+      <w:r>
+        <w:t xml:space="preserve">— see file for terms.</w:t>
+      </w:r>
+    </w:p>
+    <w:bookmarkEnd w:id="64"/>
+    <w:bookmarkStart w:id="65" w:name="contact--contribution"/>
+    <w:p>
+      <w:pPr>
+        <w:pStyle w:val="Heading2"/>
+      </w:pPr>
+      <w:r>
+        <w:t xml:space="preserve">Contact / contribution</w:t>
+      </w:r>
+    </w:p>
+    <w:p>
+      <w:pPr>
+        <w:pStyle w:val="FirstParagraph"/>
+      </w:pPr>
+      <w:r>
+        <w:t xml:space="preserve">Substantive contributions land via PRs on GitHub; mirrors are read-only for external consumers. Inheritance rules and the gate apply to every PR.</w:t>
+      </w:r>
+    </w:p>
+    <w:p>
+      <w:r>
+        <w:pict>
+          <v:rect style="width:0;height:1.5pt" o:hralign="center" o:hrstd="t" o:hr="t"/>
+        </w:pict>
+      </w:r>
+    </w:p>
+    <w:bookmarkEnd w:id="65"/>
+    <w:bookmarkStart w:id="69" w:name="sources-verified"/>
+    <w:p>
+      <w:pPr>
+        <w:pStyle w:val="Heading2"/>
+      </w:pPr>
+      <w:r>
+        <w:t xml:space="preserve">Sources verified</w:t>
+      </w:r>
+    </w:p>
+    <w:p>
+      <w:pPr>
+        <w:pStyle w:val="FirstParagraph"/>
+      </w:pPr>
+      <w:r>
+        <w:t xml:space="preserve">Per HelixConstitution §11.4.99 + Herald §108.n (Latest-Source Documentation Cross-Reference Mandate). This README is a gateway document — the substantive operator-facing instructions live in the per-channel / per-dispatcher guides linked above. Each linked guide carries its own</w:t>
+      </w:r>
+      <w:r>
+        <w:t xml:space="preserve"> </w:t>
+      </w:r>
+      <w:r>
+        <w:rPr>
+          <w:rStyle w:val="VerbatimChar"/>
+        </w:rPr>
+        <w:t xml:space="preserve">## Sources verified</w:t>
+      </w:r>
+      <w:r>
+        <w:t xml:space="preserve"> </w:t>
+      </w:r>
+      <w:r>
+        <w:t xml:space="preserve">footer covering the external services it documents. The cross-references below cover the external claims this README makes directly.</w:t>
+      </w:r>
+    </w:p>
+    <w:p>
+      <w:pPr>
+        <w:pStyle w:val="BodyText"/>
+      </w:pPr>
+      <w:r>
+        <w:rPr>
+          <w:b/>
+          <w:bCs/>
+        </w:rPr>
+        <w:t xml:space="preserve">Last verified:</w:t>
+      </w:r>
+      <w:r>
+        <w:t xml:space="preserve"> </w:t>
+      </w:r>
+      <w:r>
+        <w:t xml:space="preserve">2026-05-28</w:t>
+      </w:r>
+    </w:p>
+    <w:tbl>
+      <w:tblPr>
+        <w:tblStyle w:val="Table"/>
+        <w:tblW w:type="auto" w:w="0"/>
+        <w:tblLook w:firstRow="1" w:lastRow="0" w:firstColumn="0" w:lastColumn="0" w:noHBand="0" w:noVBand="0" w:val="0020"/>
+      </w:tblPr>
+      <w:tblGrid>
+        <w:gridCol w:w="2640"/>
+        <w:gridCol w:w="2640"/>
+        <w:gridCol w:w="2640"/>
+      </w:tblGrid>
+      <w:tr>
+        <w:trPr>
+          <w:tblHeader w:val="on"/>
+        </w:trPr>
+        <w:tc>
+          <w:tcPr/>
+          <w:p>
+            <w:pPr>
+              <w:pStyle w:val="Compact"/>
+            </w:pPr>
+            <w:r>
               <w:t xml:space="preserve">Source</w:t>
             </w:r>
           </w:p>
@@ -3860,7 +4726,7 @@
             <w:pPr>
               <w:pStyle w:val="Compact"/>
             </w:pPr>
-            <w:hyperlink r:id="rId57">
+            <w:hyperlink r:id="rId66">
               <w:r>
                 <w:rPr>
                   <w:rStyle w:val="Hyperlink"/>
@@ -3899,7 +4765,7 @@
             <w:r>
               <w:t xml:space="preserve"> </w:t>
             </w:r>
-            <w:hyperlink r:id="rId58">
+            <w:hyperlink r:id="rId67">
               <w:r>
                 <w:rPr>
                   <w:rStyle w:val="VerbatimChar"/>
@@ -3934,7 +4800,7 @@
             <w:pPr>
               <w:pStyle w:val="Compact"/>
             </w:pPr>
-            <w:hyperlink r:id="rId59">
+            <w:hyperlink r:id="rId68">
               <w:r>
                 <w:rPr>
                   <w:rStyle w:val="Hyperlink"/>
@@ -3991,7 +4857,7 @@
             <w:pPr>
               <w:pStyle w:val="Compact"/>
             </w:pPr>
-            <w:hyperlink r:id="rId49">
+            <w:hyperlink r:id="rId58">
               <w:r>
                 <w:rPr>
                   <w:rStyle w:val="VerbatimChar"/>
@@ -4118,8 +4984,8 @@
         <w:t xml:space="preserve">(repo-layout changes, new flavors, new mirror hosts, new linked guides) — no time-bound staleness. Linked guides MUST be kept current per their own footers.</w:t>
       </w:r>
     </w:p>
-    <w:bookmarkEnd w:id="60"/>
-    <w:bookmarkEnd w:id="61"/>
+    <w:bookmarkEnd w:id="69"/>
+    <w:bookmarkEnd w:id="70"/>
     <w:sectPr>
       <w:footnotePr>
         <w:numRestart w:val="eachSect"/>

</xml_diff>

<commit_message>
docs: iherald /v1/webhooks/page is LIVE (HRD-024) — update README + INTEGRATION + IHERALD.md from the stale 501-stub framing
The HRD-024 handler (commit 1550c04) flipped the route from 501 stub to a live JWT-gated escalation handler — so every doc that described it as 'an honest 501 stub' is now factually wrong (a documentation bluff). Updated README per-flavor row, INTEGRATION §1 + §10 rows, and IHERALD.md (Status summary + §1 + §3 + cross-ref) to describe the live handler (classify→emit→persist→audit→202+Receipt) + the honest third-party-pager-egress follow-up. Siblings regenerated.

Co-Authored-By: Claude Opus 4.8 <noreply@anthropic.com>
</commit_message>
<xml_diff>
--- a/README.docx
+++ b/README.docx
@@ -3629,13 +3629,13 @@
               <w:rPr>
                 <w:rStyle w:val="VerbatimChar"/>
               </w:rPr>
-              <w:t xml:space="preserve">/v1/webhooks/page</w:t>
+              <w:t xml:space="preserve">POST /v1/webhooks/page</w:t>
             </w:r>
             <w:r>
               <w:t xml:space="preserve"> </w:t>
             </w:r>
             <w:r>
-              <w:t xml:space="preserve">is an honest 501 stub pending HRD-024</w:t>
+              <w:t xml:space="preserve">is a LIVE JWT-gated escalation handler (drives the bindings Pipeline → emits the escalation CloudEvent → 202 + Receipt; third-party pager egress is a follow-up subscriber)</w:t>
             </w:r>
           </w:p>
         </w:tc>

</xml_diff>